<commit_message>
Russify remaining DWH labels in both resumes
Co-authored-by: dimonix2019 <dimonix2019@users.noreply.github.com>
</commit_message>
<xml_diff>
--- a/Abramov_DN_resume_FUEL.docx
+++ b/Abramov_DN_resume_FUEL.docx
@@ -576,7 +576,7 @@
           <w:sz w:val="21"/>
           <w:lang w:val="ru-RU"/>
         </w:rPr>
-        <w:t xml:space="preserve">Технический руководитель проекта </w:t>
+        <w:t>Технический руководитель проекта хранилища данных</w:t>
       </w:r>
       <w:r>
         <w:rPr>
@@ -585,7 +585,6 @@
           <w:color w:val="222222"/>
           <w:sz w:val="21"/>
         </w:rPr>
-        <w:t>DWH</w:t>
       </w:r>
     </w:p>
     <w:p>
@@ -618,83 +617,74 @@
           <w:sz w:val="20"/>
           <w:lang w:val="ru-RU"/>
         </w:rPr>
-        <w:t xml:space="preserve">Создание </w:t>
-      </w:r>
-      <w:r>
-        <w:rPr>
-          <w:rFonts w:ascii="Arial" w:eastAsia="Arial" w:hAnsi="Arial"/>
-          <w:color w:val="222222"/>
-          <w:sz w:val="20"/>
-        </w:rPr>
-        <w:t>DWH</w:t>
-      </w:r>
-      <w:r>
-        <w:rPr>
-          <w:rFonts w:ascii="Arial" w:eastAsia="Arial" w:hAnsi="Arial"/>
-          <w:color w:val="222222"/>
-          <w:sz w:val="20"/>
-          <w:lang w:val="ru-RU"/>
-        </w:rPr>
-        <w:t xml:space="preserve"> на </w:t>
-      </w:r>
-      <w:r>
-        <w:rPr>
-          <w:rFonts w:ascii="Arial" w:eastAsia="Arial" w:hAnsi="Arial"/>
-          <w:color w:val="222222"/>
-          <w:sz w:val="20"/>
-        </w:rPr>
-        <w:t>open</w:t>
-      </w:r>
-      <w:r>
-        <w:rPr>
-          <w:rFonts w:ascii="Arial" w:eastAsia="Arial" w:hAnsi="Arial"/>
-          <w:color w:val="222222"/>
-          <w:sz w:val="20"/>
-          <w:lang w:val="ru-RU"/>
-        </w:rPr>
-        <w:t>-</w:t>
-      </w:r>
-      <w:r>
-        <w:rPr>
-          <w:rFonts w:ascii="Arial" w:eastAsia="Arial" w:hAnsi="Arial"/>
-          <w:color w:val="222222"/>
-          <w:sz w:val="20"/>
-        </w:rPr>
-        <w:t>source</w:t>
-      </w:r>
-      <w:r>
-        <w:rPr>
-          <w:rFonts w:ascii="Arial" w:eastAsia="Arial" w:hAnsi="Arial"/>
-          <w:color w:val="222222"/>
-          <w:sz w:val="20"/>
-          <w:lang w:val="ru-RU"/>
-        </w:rPr>
-        <w:t xml:space="preserve"> стеке: архитектура, инфраструктура, контуры загрузки, витрины; затем подключение </w:t>
-      </w:r>
-      <w:r>
-        <w:rPr>
-          <w:rFonts w:ascii="Arial" w:eastAsia="Arial" w:hAnsi="Arial"/>
-          <w:color w:val="222222"/>
-          <w:sz w:val="20"/>
-        </w:rPr>
-        <w:t>BI</w:t>
-      </w:r>
-      <w:r>
-        <w:rPr>
-          <w:rFonts w:ascii="Arial" w:eastAsia="Arial" w:hAnsi="Arial"/>
-          <w:color w:val="222222"/>
-          <w:sz w:val="20"/>
-          <w:lang w:val="ru-RU"/>
-        </w:rPr>
-        <w:t xml:space="preserve">. </w:t>
-      </w:r>
-      <w:r>
-        <w:rPr>
-          <w:rFonts w:ascii="Arial" w:eastAsia="Arial" w:hAnsi="Arial"/>
-          <w:color w:val="222222"/>
-          <w:sz w:val="20"/>
-        </w:rPr>
-        <w:t>Выстроен CI/CD для поставки изменений по контурам хранилища.</w:t>
+        <w:t>Создание хранилища данных на open-source стеке: архитектура, инфраструктура, контуры загрузки, витрины; затем подключение BI. Выстроен CI/CD для поставки изменений по контурам хранилища.</w:t>
+      </w:r>
+      <w:r>
+        <w:rPr>
+          <w:rFonts w:ascii="Arial" w:eastAsia="Arial" w:hAnsi="Arial"/>
+          <w:color w:val="222222"/>
+          <w:sz w:val="20"/>
+        </w:rPr>
+      </w:r>
+      <w:r>
+        <w:rPr>
+          <w:rFonts w:ascii="Arial" w:eastAsia="Arial" w:hAnsi="Arial"/>
+          <w:color w:val="222222"/>
+          <w:sz w:val="20"/>
+          <w:lang w:val="ru-RU"/>
+        </w:rPr>
+      </w:r>
+      <w:r>
+        <w:rPr>
+          <w:rFonts w:ascii="Arial" w:eastAsia="Arial" w:hAnsi="Arial"/>
+          <w:color w:val="222222"/>
+          <w:sz w:val="20"/>
+        </w:rPr>
+      </w:r>
+      <w:r>
+        <w:rPr>
+          <w:rFonts w:ascii="Arial" w:eastAsia="Arial" w:hAnsi="Arial"/>
+          <w:color w:val="222222"/>
+          <w:sz w:val="20"/>
+          <w:lang w:val="ru-RU"/>
+        </w:rPr>
+      </w:r>
+      <w:r>
+        <w:rPr>
+          <w:rFonts w:ascii="Arial" w:eastAsia="Arial" w:hAnsi="Arial"/>
+          <w:color w:val="222222"/>
+          <w:sz w:val="20"/>
+        </w:rPr>
+      </w:r>
+      <w:r>
+        <w:rPr>
+          <w:rFonts w:ascii="Arial" w:eastAsia="Arial" w:hAnsi="Arial"/>
+          <w:color w:val="222222"/>
+          <w:sz w:val="20"/>
+          <w:lang w:val="ru-RU"/>
+        </w:rPr>
+      </w:r>
+      <w:r>
+        <w:rPr>
+          <w:rFonts w:ascii="Arial" w:eastAsia="Arial" w:hAnsi="Arial"/>
+          <w:color w:val="222222"/>
+          <w:sz w:val="20"/>
+        </w:rPr>
+      </w:r>
+      <w:r>
+        <w:rPr>
+          <w:rFonts w:ascii="Arial" w:eastAsia="Arial" w:hAnsi="Arial"/>
+          <w:color w:val="222222"/>
+          <w:sz w:val="20"/>
+          <w:lang w:val="ru-RU"/>
+        </w:rPr>
+      </w:r>
+      <w:r>
+        <w:rPr>
+          <w:rFonts w:ascii="Arial" w:eastAsia="Arial" w:hAnsi="Arial"/>
+          <w:color w:val="222222"/>
+          <w:sz w:val="20"/>
+        </w:rPr>
       </w:r>
     </w:p>
     <w:p>
@@ -914,41 +904,37 @@
           <w:sz w:val="20"/>
           <w:lang w:val="ru-RU"/>
         </w:rPr>
-        <w:t xml:space="preserve">Техническое руководство проектом создания </w:t>
-      </w:r>
-      <w:r>
-        <w:rPr>
-          <w:rFonts w:ascii="Arial" w:eastAsia="Arial" w:hAnsi="Arial"/>
-          <w:color w:val="222222"/>
-          <w:sz w:val="20"/>
-        </w:rPr>
-        <w:t>DWH</w:t>
-      </w:r>
-      <w:r>
-        <w:rPr>
-          <w:rFonts w:ascii="Arial" w:eastAsia="Arial" w:hAnsi="Arial"/>
-          <w:color w:val="222222"/>
-          <w:sz w:val="20"/>
-          <w:lang w:val="ru-RU"/>
-        </w:rPr>
-        <w:t xml:space="preserve">: архитектура, инфраструктура, контуры загрузки, витрины; подключение </w:t>
-      </w:r>
-      <w:r>
-        <w:rPr>
-          <w:rFonts w:ascii="Arial" w:eastAsia="Arial" w:hAnsi="Arial"/>
-          <w:color w:val="222222"/>
-          <w:sz w:val="20"/>
-        </w:rPr>
-        <w:t>BI</w:t>
-      </w:r>
-      <w:r>
-        <w:rPr>
-          <w:rFonts w:ascii="Arial" w:eastAsia="Arial" w:hAnsi="Arial"/>
-          <w:color w:val="222222"/>
-          <w:sz w:val="20"/>
-          <w:lang w:val="ru-RU"/>
-        </w:rPr>
-        <w:t xml:space="preserve"> после готовности контуров хранилища.</w:t>
+        <w:t>Техническое руководство проектом создания хранилища данных: архитектура, инфраструктура, контуры загрузки, витрины; подключение BI после готовности контуров хранилища.</w:t>
+      </w:r>
+      <w:r>
+        <w:rPr>
+          <w:rFonts w:ascii="Arial" w:eastAsia="Arial" w:hAnsi="Arial"/>
+          <w:color w:val="222222"/>
+          <w:sz w:val="20"/>
+        </w:rPr>
+      </w:r>
+      <w:r>
+        <w:rPr>
+          <w:rFonts w:ascii="Arial" w:eastAsia="Arial" w:hAnsi="Arial"/>
+          <w:color w:val="222222"/>
+          <w:sz w:val="20"/>
+          <w:lang w:val="ru-RU"/>
+        </w:rPr>
+      </w:r>
+      <w:r>
+        <w:rPr>
+          <w:rFonts w:ascii="Arial" w:eastAsia="Arial" w:hAnsi="Arial"/>
+          <w:color w:val="222222"/>
+          <w:sz w:val="20"/>
+        </w:rPr>
+      </w:r>
+      <w:r>
+        <w:rPr>
+          <w:rFonts w:ascii="Arial" w:eastAsia="Arial" w:hAnsi="Arial"/>
+          <w:color w:val="222222"/>
+          <w:sz w:val="20"/>
+          <w:lang w:val="ru-RU"/>
+        </w:rPr>
       </w:r>
     </w:p>
     <w:p>

</xml_diff>